<commit_message>
Manuscript: title-page wording, section 5.8 heading
Co-Authored-By: Claude Sonnet 5.5 <noreply@anthropic.com>
</commit_message>
<xml_diff>
--- a/manuscript/Manuscript_TUST.docx
+++ b/manuscript/Manuscript_TUST.docx
@@ -65,7 +65,7 @@
         <w:rPr>
           <w:sz w:val="19"/>
         </w:rPr>
-        <w:t xml:space="preserve">Manuscript submitted to </w:t>
+        <w:t xml:space="preserve">Manuscript prepared for submission to </w:t>
       </w:r>
       <w:r>
         <w:rPr>
@@ -9922,7 +9922,7 @@
         <w:rPr>
           <w:rFonts w:ascii="Times New Roman" w:hAnsi="Times New Roman"/>
         </w:rPr>
-        <w:t>5.8 Official cross-sections and shadowing by overlying lines</w:t>
+        <w:t>5.8 Cross-sections and shadowing by overlying lines</w:t>
       </w:r>
     </w:p>
     <w:p>

</xml_diff>